<commit_message>
Update CV content: About Me wording, name, clearance, new bullets, CPM/Symbos note
- About Me: reorder years-of-experience/leadership sentence
- Header: add last name (Singh) and bold AGSVA clearance line
- MOHR role: add git credential cleanup bullet, PR/code review bullet,
  and ADECCO client detail
- Note CPM Australia's acquisition by Symbos
- Regenerate Hans-CV.pdf from the updated docx via LibreOffice
- Minor navbar flex spacing tweak
</commit_message>
<xml_diff>
--- a/src/assets/docs/Hans-CV.docx
+++ b/src/assets/docs/Hans-CV.docx
@@ -18,7 +18,17 @@
           <w:sz w:val="28"/>
           <w:szCs w:val="28"/>
         </w:rPr>
-        <w:t>Hansdeep (Hans)</w:t>
+        <w:t>Hansdeep (Hans) Singh</w:t>
+      </w:r>
+      <w:r>
+        <w:rPr>
+          <w:rFonts w:ascii="Verdana" w:eastAsia="MS Mincho" w:hAnsi="Verdana" w:cs="Tahoma"/>
+          <w:b/>
+          <w:sz w:val="24"/>
+          <w:szCs w:val="24"/>
+        </w:rPr>
+        <w:br/>
+        <w:t>AGSVA security clearance, both Baseline and NV1</w:t>
       </w:r>
       <w:r>
         <w:rPr>
@@ -154,7 +164,7 @@
           <w:szCs w:val="22"/>
           <w:lang w:val="en-US"/>
         </w:rPr>
-        <w:t xml:space="preserve">Over </w:t>
+        <w:t>Over 18 Years of hands-on experience in Software Development and 5 years in Leadership</w:t>
       </w:r>
       <w:r>
         <w:rPr>
@@ -163,61 +173,7 @@
           <w:szCs w:val="22"/>
           <w:lang w:val="en-US"/>
         </w:rPr>
-        <w:t>5</w:t>
-      </w:r>
-      <w:r>
-        <w:rPr>
-          <w:rFonts w:ascii="Verdana" w:eastAsia="MS Mincho" w:hAnsi="Verdana" w:cs="Tahoma"/>
-          <w:sz w:val="22"/>
-          <w:szCs w:val="22"/>
-          <w:lang w:val="en-US"/>
-        </w:rPr>
-        <w:t xml:space="preserve"> years in Leadership and Over 1</w:t>
-      </w:r>
-      <w:r>
-        <w:rPr>
-          <w:rFonts w:ascii="Verdana" w:eastAsia="MS Mincho" w:hAnsi="Verdana" w:cs="Tahoma"/>
-          <w:sz w:val="22"/>
-          <w:szCs w:val="22"/>
-          <w:lang w:val="en-US"/>
-        </w:rPr>
-        <w:t>8</w:t>
-      </w:r>
-      <w:r>
-        <w:rPr>
-          <w:rFonts w:ascii="Verdana" w:eastAsia="MS Mincho" w:hAnsi="Verdana" w:cs="Tahoma"/>
-          <w:sz w:val="22"/>
-          <w:szCs w:val="22"/>
-          <w:lang w:val="en-US"/>
-        </w:rPr>
-        <w:t xml:space="preserve"> Years of</w:t>
-      </w:r>
-      <w:r>
-        <w:rPr>
-          <w:rFonts w:ascii="Verdana" w:eastAsia="MS Mincho" w:hAnsi="Verdana" w:cs="Tahoma"/>
-          <w:sz w:val="22"/>
-          <w:szCs w:val="22"/>
-          <w:lang w:val="en-US"/>
-        </w:rPr>
-        <w:t xml:space="preserve"> </w:t>
-      </w:r>
-      <w:r>
-        <w:rPr>
-          <w:rFonts w:ascii="Verdana" w:eastAsia="MS Mincho" w:hAnsi="Verdana" w:cs="Tahoma"/>
-          <w:sz w:val="22"/>
-          <w:szCs w:val="22"/>
-          <w:lang w:val="en-US"/>
-        </w:rPr>
-        <w:t>hands-on</w:t>
-      </w:r>
-      <w:r>
-        <w:rPr>
-          <w:rFonts w:ascii="Verdana" w:eastAsia="MS Mincho" w:hAnsi="Verdana" w:cs="Tahoma"/>
-          <w:sz w:val="22"/>
-          <w:szCs w:val="22"/>
-          <w:lang w:val="en-US"/>
-        </w:rPr>
-        <w:t xml:space="preserve"> experience in Software Development including Web - Angular, MVC, ASP.net, .NET Framework, Cloud - AZURE Android, IOS development. Strong hold on current technologies, up for grabs into upcoming ones.</w:t>
+        <w:t xml:space="preserve"> including Web - Angular, MVC, ASP.net, .NET Framework, Cloud - AZURE Android, IOS development. Strong hold on current technologies, up for grabs into upcoming ones.</w:t>
       </w:r>
     </w:p>
     <w:p>
@@ -1584,23 +1540,39 @@
                 <w:rFonts w:ascii="Verdana" w:hAnsi="Verdana" w:cs="Arial"/>
                 <w:lang w:val="en-AU"/>
               </w:rPr>
-              <w:t xml:space="preserve">Working as a Full Stack Developer, using </w:t>
-            </w:r>
-            <w:r>
-              <w:rPr>
-                <w:rFonts w:ascii="Verdana" w:hAnsi="Verdana" w:cs="Arial"/>
-                <w:b/>
-                <w:bCs/>
-                <w:lang w:val="en-AU"/>
-              </w:rPr>
-              <w:t>AI agentic development</w:t>
-            </w:r>
-            <w:r>
-              <w:rPr>
-                <w:rFonts w:ascii="Verdana" w:hAnsi="Verdana" w:cs="Arial"/>
-                <w:lang w:val="en-AU"/>
-              </w:rPr>
-              <w:t xml:space="preserve"> tools and workflows to accelerate delivery.</w:t>
+              <w:t xml:space="preserve">Cleaned the </w:t>
+            </w:r>
+            <w:r>
+              <w:rPr>
+                <w:rFonts w:ascii="Verdana" w:hAnsi="Verdana" w:cs="Arial"/>
+                <w:b/>
+                <w:bCs/>
+                <w:lang w:val="en-AU"/>
+              </w:rPr>
+              <w:t>git repository</w:t>
+            </w:r>
+            <w:r>
+              <w:rPr>
+                <w:rFonts w:ascii="Verdana" w:hAnsi="Verdana" w:cs="Arial"/>
+                <w:lang w:val="en-AU"/>
+              </w:rPr>
+              <w:t xml:space="preserve"> by removing SMS and Email service credentials from the codebase, migrating them to </w:t>
+            </w:r>
+            <w:r>
+              <w:rPr>
+                <w:rFonts w:ascii="Verdana" w:hAnsi="Verdana" w:cs="Arial"/>
+                <w:b/>
+                <w:bCs/>
+                <w:lang w:val="en-AU"/>
+              </w:rPr>
+              <w:t>AWS Parameter Store</w:t>
+            </w:r>
+            <w:r>
+              <w:rPr>
+                <w:rFonts w:ascii="Verdana" w:hAnsi="Verdana" w:cs="Arial"/>
+                <w:lang w:val="en-AU"/>
+              </w:rPr>
+              <w:t xml:space="preserve">, and purging git history of all commits containing sensitive credentials.</w:t>
             </w:r>
           </w:p>
           <w:p>
@@ -1621,23 +1593,23 @@
                 <w:rFonts w:ascii="Verdana" w:hAnsi="Verdana" w:cs="Arial"/>
                 <w:lang w:val="en-AU"/>
               </w:rPr>
-              <w:t xml:space="preserve">Building and polishing the </w:t>
-            </w:r>
-            <w:r>
-              <w:rPr>
-                <w:rFonts w:ascii="Verdana" w:hAnsi="Verdana" w:cs="Arial"/>
-                <w:b/>
-                <w:bCs/>
-                <w:lang w:val="en-AU"/>
-              </w:rPr>
-              <w:t>skills</w:t>
-            </w:r>
-            <w:r>
-              <w:rPr>
-                <w:rFonts w:ascii="Verdana" w:hAnsi="Verdana" w:cs="Arial"/>
-                <w:lang w:val="en-AU"/>
-              </w:rPr>
-              <w:t xml:space="preserve"> that AI agents use to generate refined, production-ready code with less hallucinations.</w:t>
+              <w:t xml:space="preserve">Working as a Full Stack Developer, using </w:t>
+            </w:r>
+            <w:r>
+              <w:rPr>
+                <w:rFonts w:ascii="Verdana" w:hAnsi="Verdana" w:cs="Arial"/>
+                <w:b/>
+                <w:bCs/>
+                <w:lang w:val="en-AU"/>
+              </w:rPr>
+              <w:t>AI agentic development</w:t>
+            </w:r>
+            <w:r>
+              <w:rPr>
+                <w:rFonts w:ascii="Verdana" w:hAnsi="Verdana" w:cs="Arial"/>
+                <w:lang w:val="en-AU"/>
+              </w:rPr>
+              <w:t xml:space="preserve"> tools and workflows to accelerate delivery.</w:t>
             </w:r>
           </w:p>
           <w:p>
@@ -1658,39 +1630,23 @@
                 <w:rFonts w:ascii="Verdana" w:hAnsi="Verdana" w:cs="Arial"/>
                 <w:lang w:val="en-AU"/>
               </w:rPr>
-              <w:t xml:space="preserve">Front end built on </w:t>
-            </w:r>
-            <w:r>
-              <w:rPr>
-                <w:rFonts w:ascii="Verdana" w:hAnsi="Verdana" w:cs="Arial"/>
-                <w:b/>
-                <w:bCs/>
-                <w:lang w:val="en-AU"/>
-              </w:rPr>
-              <w:t>Angular</w:t>
-            </w:r>
-            <w:r>
-              <w:rPr>
-                <w:rFonts w:ascii="Verdana" w:hAnsi="Verdana" w:cs="Arial"/>
-                <w:lang w:val="en-AU"/>
-              </w:rPr>
-              <w:t xml:space="preserve">, back end built on </w:t>
-            </w:r>
-            <w:r>
-              <w:rPr>
-                <w:rFonts w:ascii="Verdana" w:hAnsi="Verdana" w:cs="Arial"/>
-                <w:b/>
-                <w:bCs/>
-                <w:lang w:val="en-AU"/>
-              </w:rPr>
-              <w:t>.NET</w:t>
-            </w:r>
-            <w:r>
-              <w:rPr>
-                <w:rFonts w:ascii="Verdana" w:hAnsi="Verdana" w:cs="Arial"/>
-                <w:lang w:val="en-AU"/>
-              </w:rPr>
-              <w:t>.</w:t>
+              <w:t xml:space="preserve">Building and polishing the </w:t>
+            </w:r>
+            <w:r>
+              <w:rPr>
+                <w:rFonts w:ascii="Verdana" w:hAnsi="Verdana" w:cs="Arial"/>
+                <w:b/>
+                <w:bCs/>
+                <w:lang w:val="en-AU"/>
+              </w:rPr>
+              <w:t>skills</w:t>
+            </w:r>
+            <w:r>
+              <w:rPr>
+                <w:rFonts w:ascii="Verdana" w:hAnsi="Verdana" w:cs="Arial"/>
+                <w:lang w:val="en-AU"/>
+              </w:rPr>
+              <w:t xml:space="preserve"> that AI agents use to generate refined, production-ready code with less hallucinations.</w:t>
             </w:r>
           </w:p>
           <w:p>
@@ -1711,48 +1667,32 @@
                 <w:rFonts w:ascii="Verdana" w:hAnsi="Verdana" w:cs="Arial"/>
                 <w:lang w:val="en-AU"/>
               </w:rPr>
-              <w:t xml:space="preserve">Infrastructure and tooling includes </w:t>
-            </w:r>
-            <w:r>
-              <w:rPr>
-                <w:rFonts w:ascii="Verdana" w:hAnsi="Verdana" w:cs="Arial"/>
-                <w:b/>
-                <w:bCs/>
-                <w:lang w:val="en-AU"/>
-              </w:rPr>
-              <w:t>Docker</w:t>
-            </w:r>
-            <w:r>
-              <w:rPr>
-                <w:rFonts w:ascii="Verdana" w:hAnsi="Verdana" w:cs="Arial"/>
-                <w:lang w:val="en-AU"/>
-              </w:rPr>
-              <w:t xml:space="preserve">, </w:t>
-            </w:r>
-            <w:r>
-              <w:rPr>
-                <w:rFonts w:ascii="Verdana" w:hAnsi="Verdana" w:cs="Arial"/>
-                <w:b/>
-                <w:bCs/>
-                <w:lang w:val="en-AU"/>
-              </w:rPr>
-              <w:t>RabbitMQ</w:t>
-            </w:r>
-            <w:r>
-              <w:rPr>
-                <w:rFonts w:ascii="Verdana" w:hAnsi="Verdana" w:cs="Arial"/>
-                <w:lang w:val="en-AU"/>
-              </w:rPr>
-              <w:t xml:space="preserve"> and </w:t>
-            </w:r>
-            <w:r>
-              <w:rPr>
-                <w:rFonts w:ascii="Verdana" w:hAnsi="Verdana" w:cs="Arial"/>
-                <w:b/>
-                <w:bCs/>
-                <w:lang w:val="en-AU"/>
-              </w:rPr>
-              <w:t>AWS</w:t>
+              <w:t xml:space="preserve">Front end built on </w:t>
+            </w:r>
+            <w:r>
+              <w:rPr>
+                <w:rFonts w:ascii="Verdana" w:hAnsi="Verdana" w:cs="Arial"/>
+                <w:b/>
+                <w:bCs/>
+                <w:lang w:val="en-AU"/>
+              </w:rPr>
+              <w:t>Angular</w:t>
+            </w:r>
+            <w:r>
+              <w:rPr>
+                <w:rFonts w:ascii="Verdana" w:hAnsi="Verdana" w:cs="Arial"/>
+                <w:lang w:val="en-AU"/>
+              </w:rPr>
+              <w:t xml:space="preserve">, back end built on </w:t>
+            </w:r>
+            <w:r>
+              <w:rPr>
+                <w:rFonts w:ascii="Verdana" w:hAnsi="Verdana" w:cs="Arial"/>
+                <w:b/>
+                <w:bCs/>
+                <w:lang w:val="en-AU"/>
+              </w:rPr>
+              <w:t>.NET</w:t>
             </w:r>
             <w:r>
               <w:rPr>
@@ -1780,23 +1720,55 @@
                 <w:rFonts w:ascii="Verdana" w:hAnsi="Verdana" w:cs="Arial"/>
                 <w:lang w:val="en-AU"/>
               </w:rPr>
-              <w:t xml:space="preserve">Delivered a full </w:t>
-            </w:r>
-            <w:r>
-              <w:rPr>
-                <w:rFonts w:ascii="Verdana" w:hAnsi="Verdana" w:cs="Arial"/>
-                <w:b/>
-                <w:bCs/>
-                <w:lang w:val="en-AU"/>
-              </w:rPr>
-              <w:t>data migration</w:t>
-            </w:r>
-            <w:r>
-              <w:rPr>
-                <w:rFonts w:ascii="Verdana" w:hAnsi="Verdana" w:cs="Arial"/>
-                <w:lang w:val="en-AU"/>
-              </w:rPr>
-              <w:t xml:space="preserve"> project for Defence Force Recruitment</w:t>
+              <w:t xml:space="preserve">Infrastructure and tooling includes </w:t>
+            </w:r>
+            <w:r>
+              <w:rPr>
+                <w:rFonts w:ascii="Verdana" w:hAnsi="Verdana" w:cs="Arial"/>
+                <w:b/>
+                <w:bCs/>
+                <w:lang w:val="en-AU"/>
+              </w:rPr>
+              <w:t>Docker</w:t>
+            </w:r>
+            <w:r>
+              <w:rPr>
+                <w:rFonts w:ascii="Verdana" w:hAnsi="Verdana" w:cs="Arial"/>
+                <w:lang w:val="en-AU"/>
+              </w:rPr>
+              <w:t xml:space="preserve">, </w:t>
+            </w:r>
+            <w:r>
+              <w:rPr>
+                <w:rFonts w:ascii="Verdana" w:hAnsi="Verdana" w:cs="Arial"/>
+                <w:b/>
+                <w:bCs/>
+                <w:lang w:val="en-AU"/>
+              </w:rPr>
+              <w:t>RabbitMQ</w:t>
+            </w:r>
+            <w:r>
+              <w:rPr>
+                <w:rFonts w:ascii="Verdana" w:hAnsi="Verdana" w:cs="Arial"/>
+                <w:lang w:val="en-AU"/>
+              </w:rPr>
+              <w:t xml:space="preserve"> and </w:t>
+            </w:r>
+            <w:r>
+              <w:rPr>
+                <w:rFonts w:ascii="Verdana" w:hAnsi="Verdana" w:cs="Arial"/>
+                <w:b/>
+                <w:bCs/>
+                <w:lang w:val="en-AU"/>
+              </w:rPr>
+              <w:t>AWS</w:t>
+            </w:r>
+            <w:r>
+              <w:rPr>
+                <w:rFonts w:ascii="Verdana" w:hAnsi="Verdana" w:cs="Arial"/>
+                <w:lang w:val="en-AU"/>
+              </w:rPr>
+              <w:t>.</w:t>
             </w:r>
           </w:p>
           <w:p>
@@ -1817,6 +1789,43 @@
                 <w:rFonts w:ascii="Verdana" w:hAnsi="Verdana" w:cs="Arial"/>
                 <w:lang w:val="en-AU"/>
               </w:rPr>
+              <w:t xml:space="preserve">Delivered a full </w:t>
+            </w:r>
+            <w:r>
+              <w:rPr>
+                <w:rFonts w:ascii="Verdana" w:hAnsi="Verdana" w:cs="Arial"/>
+                <w:b/>
+                <w:bCs/>
+                <w:lang w:val="en-AU"/>
+              </w:rPr>
+              <w:t>data migration</w:t>
+            </w:r>
+            <w:r>
+              <w:rPr>
+                <w:rFonts w:ascii="Verdana" w:hAnsi="Verdana" w:cs="Arial"/>
+                <w:lang w:val="en-AU"/>
+              </w:rPr>
+              <w:t xml:space="preserve"> project for Defence Force Recruitment</w:t>
+            </w:r>
+          </w:p>
+          <w:p>
+            <w:pPr>
+              <w:numPr>
+                <w:ilvl w:val="0"/>
+                <w:numId w:val="4"/>
+              </w:numPr>
+              <w:shd w:val="clear" w:color="auto" w:fill="FFFFFF"/>
+              <w:spacing w:before="100" w:beforeAutospacing="1" w:after="100" w:afterAutospacing="1"/>
+              <w:rPr>
+                <w:rFonts w:ascii="Verdana" w:hAnsi="Verdana" w:cs="Arial"/>
+                <w:lang w:val="en-AU" w:eastAsia="en-AU"/>
+              </w:rPr>
+            </w:pPr>
+            <w:r>
+              <w:rPr>
+                <w:rFonts w:ascii="Verdana" w:hAnsi="Verdana" w:cs="Arial"/>
+                <w:lang w:val="en-AU"/>
+              </w:rPr>
               <w:t xml:space="preserve">Automated </w:t>
             </w:r>
             <w:r>
@@ -1833,7 +1842,60 @@
                 <w:rFonts w:ascii="Verdana" w:hAnsi="Verdana" w:cs="Arial"/>
                 <w:lang w:val="en-AU"/>
               </w:rPr>
-              <w:t>.</w:t>
+              <w:t xml:space="preserve"> for ADECCO client.</w:t>
+            </w:r>
+          </w:p>
+          <w:p>
+            <w:pPr>
+              <w:numPr>
+                <w:ilvl w:val="0"/>
+                <w:numId w:val="4"/>
+              </w:numPr>
+              <w:shd w:val="clear" w:color="auto" w:fill="FFFFFF"/>
+              <w:spacing w:before="100" w:beforeAutospacing="1" w:after="100" w:afterAutospacing="1"/>
+              <w:rPr>
+                <w:rFonts w:ascii="Verdana" w:hAnsi="Verdana" w:cs="Arial"/>
+                <w:lang w:val="en-AU" w:eastAsia="en-AU"/>
+              </w:rPr>
+            </w:pPr>
+            <w:r>
+              <w:rPr>
+                <w:rFonts w:ascii="Verdana" w:hAnsi="Verdana" w:cs="Arial"/>
+                <w:lang w:val="en-AU"/>
+              </w:rPr>
+              <w:t xml:space="preserve">Perform routine </w:t>
+            </w:r>
+            <w:r>
+              <w:rPr>
+                <w:rFonts w:ascii="Verdana" w:hAnsi="Verdana" w:cs="Arial"/>
+                <w:b/>
+                <w:bCs/>
+                <w:lang w:val="en-AU"/>
+              </w:rPr>
+              <w:t>Pull Request</w:t>
+            </w:r>
+            <w:r>
+              <w:rPr>
+                <w:rFonts w:ascii="Verdana" w:hAnsi="Verdana" w:cs="Arial"/>
+                <w:lang w:val="en-AU"/>
+              </w:rPr>
+              <w:t xml:space="preserve"> and </w:t>
+            </w:r>
+            <w:r>
+              <w:rPr>
+                <w:rFonts w:ascii="Verdana" w:hAnsi="Verdana" w:cs="Arial"/>
+                <w:b/>
+                <w:bCs/>
+                <w:lang w:val="en-AU"/>
+              </w:rPr>
+              <w:t>Code Review</w:t>
+            </w:r>
+            <w:r>
+              <w:rPr>
+                <w:rFonts w:ascii="Verdana" w:hAnsi="Verdana" w:cs="Arial"/>
+                <w:lang w:val="en-AU"/>
+              </w:rPr>
+              <w:t xml:space="preserve"> tasks.</w:t>
             </w:r>
           </w:p>
         </w:tc>
@@ -2332,6 +2394,7 @@
                 <w:rFonts w:ascii="Verdana" w:hAnsi="Verdana" w:cs="Arial"/>
                 <w:lang w:val="en-AU"/>
               </w:rPr>
+              <w:lastRenderedPageBreak/>
               <w:t>Weekly scrum for monitoring on-going development and adhering to task deadlines.</w:t>
             </w:r>
           </w:p>
@@ -3069,7 +3132,7 @@
                 <w:szCs w:val="22"/>
                 <w:lang w:val="en-US" w:eastAsia="en-US" w:bidi="ar-SA"/>
               </w:rPr>
-              <w:t>CPM Australia</w:t>
+              <w:t>CPM Australia (now Symbos)</w:t>
             </w:r>
           </w:p>
         </w:tc>

</xml_diff>

<commit_message>
Simplify clearance display, fix CV spacing, link My Occ Health Record
- Show clearance as just "NV1" in header/CV text (Baseline is implied)
- Remove leftover stray empty paragraphs in docx causing uneven gaps
  between SKILLS/EXPERIENCE and mid-document sections; CV now fits
  on 4 pages instead of 5
- Link the My Occ Health Record logo and add it to the CORPORATE WORK
  nav dropdown as the current/latest role

Co-Authored-By: Claude Sonnet 5 <noreply@anthropic.com>
Claude-Session: https://claude.ai/code/session_01LTb233TjGzrh7aM8KQdPke
</commit_message>
<xml_diff>
--- a/src/assets/docs/Hans-CV.docx
+++ b/src/assets/docs/Hans-CV.docx
@@ -28,7 +28,7 @@
           <w:szCs w:val="24"/>
         </w:rPr>
         <w:br/>
-        <w:t>AGSVA security clearance, both Baseline and NV1</w:t>
+        <w:t>AGSVA security clearance, NV1</w:t>
       </w:r>
       <w:r>
         <w:rPr>
@@ -1270,58 +1270,6 @@
           <w:p>
             <w:pPr>
               <w:pStyle w:val="PlainText"/>
-              <w:ind w:left="360"/>
-              <w:rPr>
-                <w:rFonts w:ascii="Verdana" w:eastAsia="MS Mincho" w:hAnsi="Verdana" w:cs="Tahoma"/>
-                <w:bCs/>
-                <w:sz w:val="22"/>
-                <w:szCs w:val="22"/>
-                <w:lang w:val="en-US" w:eastAsia="en-US" w:bidi="ar-SA"/>
-              </w:rPr>
-            </w:pPr>
-          </w:p>
-          <w:p>
-            <w:pPr>
-              <w:pStyle w:val="PlainText"/>
-              <w:ind w:left="360"/>
-              <w:rPr>
-                <w:rFonts w:ascii="Verdana" w:eastAsia="MS Mincho" w:hAnsi="Verdana" w:cs="Tahoma"/>
-                <w:bCs/>
-                <w:sz w:val="22"/>
-                <w:szCs w:val="22"/>
-                <w:lang w:val="en-US" w:eastAsia="en-US" w:bidi="ar-SA"/>
-              </w:rPr>
-            </w:pPr>
-          </w:p>
-          <w:p>
-            <w:pPr>
-              <w:pStyle w:val="PlainText"/>
-              <w:ind w:left="360"/>
-              <w:rPr>
-                <w:rFonts w:ascii="Verdana" w:eastAsia="MS Mincho" w:hAnsi="Verdana" w:cs="Tahoma"/>
-                <w:bCs/>
-                <w:sz w:val="22"/>
-                <w:szCs w:val="22"/>
-                <w:lang w:val="en-US" w:eastAsia="en-US" w:bidi="ar-SA"/>
-              </w:rPr>
-            </w:pPr>
-          </w:p>
-          <w:p>
-            <w:pPr>
-              <w:pStyle w:val="PlainText"/>
-              <w:ind w:left="360"/>
-              <w:rPr>
-                <w:rFonts w:ascii="Verdana" w:eastAsia="MS Mincho" w:hAnsi="Verdana" w:cs="Tahoma"/>
-                <w:bCs/>
-                <w:sz w:val="22"/>
-                <w:szCs w:val="22"/>
-                <w:lang w:val="en-US" w:eastAsia="en-US" w:bidi="ar-SA"/>
-              </w:rPr>
-            </w:pPr>
-          </w:p>
-          <w:p>
-            <w:pPr>
-              <w:pStyle w:val="PlainText"/>
               <w:rPr>
                 <w:rFonts w:ascii="Verdana" w:eastAsia="MS Mincho" w:hAnsi="Verdana" w:cs="Tahoma"/>
                 <w:bCs/>
@@ -1512,14 +1460,14 @@
                 <w:bCs/>
                 <w:lang w:val="en-AU"/>
               </w:rPr>
-              <w:t>AGSVA Security Clearances</w:t>
-            </w:r>
-            <w:r>
-              <w:rPr>
-                <w:rFonts w:ascii="Verdana" w:hAnsi="Verdana" w:cs="Arial"/>
-                <w:lang w:val="en-AU"/>
-              </w:rPr>
-              <w:t xml:space="preserve"> - Baseline and NV1.</w:t>
+              <w:t>AGSVA Security Clearance</w:t>
+            </w:r>
+            <w:r>
+              <w:rPr>
+                <w:rFonts w:ascii="Verdana" w:hAnsi="Verdana" w:cs="Arial"/>
+                <w:lang w:val="en-AU"/>
+              </w:rPr>
+              <w:t xml:space="preserve"> - NV1.</w:t>
             </w:r>
           </w:p>
           <w:p>
@@ -2054,7 +2002,7 @@
                 <w:szCs w:val="22"/>
                 <w:lang w:val="en-US" w:eastAsia="en-US" w:bidi="ar-SA"/>
               </w:rPr>
-              <w:t>Oct 2022 – Current</w:t>
+              <w:t>Oct 2022 – Dec 2025</w:t>
             </w:r>
           </w:p>
         </w:tc>
@@ -2515,46 +2463,6 @@
               </w:rPr>
               <w:t>on Google Play</w:t>
             </w:r>
-          </w:p>
-          <w:p>
-            <w:pPr>
-              <w:shd w:val="clear" w:color="auto" w:fill="FFFFFF"/>
-              <w:spacing w:before="100" w:beforeAutospacing="1" w:after="100" w:afterAutospacing="1"/>
-              <w:rPr>
-                <w:rFonts w:ascii="Verdana" w:hAnsi="Verdana" w:cs="Arial"/>
-                <w:lang w:val="en-AU"/>
-              </w:rPr>
-            </w:pPr>
-          </w:p>
-          <w:p>
-            <w:pPr>
-              <w:shd w:val="clear" w:color="auto" w:fill="FFFFFF"/>
-              <w:spacing w:before="100" w:beforeAutospacing="1" w:after="100" w:afterAutospacing="1"/>
-              <w:rPr>
-                <w:rFonts w:ascii="Verdana" w:hAnsi="Verdana" w:cs="Arial"/>
-                <w:lang w:val="en-AU"/>
-              </w:rPr>
-            </w:pPr>
-          </w:p>
-          <w:p>
-            <w:pPr>
-              <w:shd w:val="clear" w:color="auto" w:fill="FFFFFF"/>
-              <w:spacing w:before="100" w:beforeAutospacing="1" w:after="100" w:afterAutospacing="1"/>
-              <w:rPr>
-                <w:rFonts w:ascii="Verdana" w:hAnsi="Verdana" w:cs="Arial"/>
-                <w:lang w:val="en-AU"/>
-              </w:rPr>
-            </w:pPr>
-          </w:p>
-          <w:p>
-            <w:pPr>
-              <w:shd w:val="clear" w:color="auto" w:fill="FFFFFF"/>
-              <w:spacing w:before="100" w:beforeAutospacing="1" w:after="100" w:afterAutospacing="1"/>
-              <w:rPr>
-                <w:rFonts w:ascii="Verdana" w:hAnsi="Verdana" w:cs="Arial"/>
-                <w:lang w:val="en-AU"/>
-              </w:rPr>
-            </w:pPr>
           </w:p>
           <w:p>
             <w:pPr>
@@ -4235,70 +4143,28 @@
           <w:p>
             <w:pPr>
               <w:pStyle w:val="NoSpacing"/>
-              <w:ind w:left="360"/>
-              <w:rPr>
-                <w:rFonts w:ascii="Verdana" w:eastAsia="MS Mincho" w:hAnsi="Verdana"/>
-                <w:sz w:val="22"/>
-                <w:szCs w:val="22"/>
-              </w:rPr>
-            </w:pPr>
-          </w:p>
-          <w:p>
-            <w:pPr>
-              <w:pStyle w:val="ListParagraph"/>
-              <w:rPr>
-                <w:rFonts w:ascii="Verdana" w:eastAsia="MS Mincho" w:hAnsi="Verdana"/>
-                <w:sz w:val="22"/>
-                <w:szCs w:val="22"/>
-              </w:rPr>
-            </w:pPr>
+              <w:numPr>
+                <w:ilvl w:val="0"/>
+                <w:numId w:val="2"/>
+              </w:numPr>
+              <w:rPr>
+                <w:rFonts w:ascii="Verdana" w:eastAsia="MS Mincho" w:hAnsi="Verdana"/>
+                <w:sz w:val="22"/>
+                <w:szCs w:val="22"/>
+              </w:rPr>
+            </w:pPr>
+            <w:r>
+              <w:rPr>
+                <w:rFonts w:ascii="Verdana" w:eastAsia="MS Mincho" w:hAnsi="Verdana"/>
+                <w:sz w:val="22"/>
+                <w:szCs w:val="22"/>
+              </w:rPr>
+              <w:t xml:space="preserve">Sports club websites development, support and Logo design </w:t>
+            </w:r>
           </w:p>
           <w:p>
             <w:pPr>
               <w:pStyle w:val="NoSpacing"/>
-              <w:numPr>
-                <w:ilvl w:val="0"/>
-                <w:numId w:val="2"/>
-              </w:numPr>
-              <w:rPr>
-                <w:rFonts w:ascii="Verdana" w:eastAsia="MS Mincho" w:hAnsi="Verdana"/>
-                <w:sz w:val="22"/>
-                <w:szCs w:val="22"/>
-              </w:rPr>
-            </w:pPr>
-            <w:r>
-              <w:rPr>
-                <w:rFonts w:ascii="Verdana" w:eastAsia="MS Mincho" w:hAnsi="Verdana"/>
-                <w:sz w:val="22"/>
-                <w:szCs w:val="22"/>
-              </w:rPr>
-              <w:t xml:space="preserve">Sports club websites development, support and Logo design </w:t>
-            </w:r>
-          </w:p>
-          <w:p>
-            <w:pPr>
-              <w:pStyle w:val="NoSpacing"/>
-              <w:rPr>
-                <w:rFonts w:ascii="Verdana" w:eastAsia="MS Mincho" w:hAnsi="Verdana"/>
-                <w:sz w:val="22"/>
-                <w:szCs w:val="22"/>
-              </w:rPr>
-            </w:pPr>
-          </w:p>
-          <w:p>
-            <w:pPr>
-              <w:pStyle w:val="NoSpacing"/>
-              <w:ind w:left="360"/>
-              <w:rPr>
-                <w:rFonts w:ascii="Verdana" w:eastAsia="MS Mincho" w:hAnsi="Verdana"/>
-                <w:sz w:val="22"/>
-                <w:szCs w:val="22"/>
-              </w:rPr>
-            </w:pPr>
-          </w:p>
-          <w:p>
-            <w:pPr>
-              <w:pStyle w:val="ListParagraph"/>
               <w:rPr>
                 <w:rFonts w:ascii="Verdana" w:eastAsia="MS Mincho" w:hAnsi="Verdana"/>
                 <w:sz w:val="22"/>

</xml_diff>